<commit_message>
Date: 15 Oct 2026
</commit_message>
<xml_diff>
--- a/Selenium Notes.docx
+++ b/Selenium Notes.docx
@@ -721,22 +721,13 @@
           <w:szCs w:val="26"/>
         </w:rPr>
       </w:pPr>
-      <w:proofErr w:type="spellStart"/>
       <w:r>
         <w:rPr>
           <w:sz w:val="28"/>
           <w:szCs w:val="26"/>
         </w:rPr>
         <w:lastRenderedPageBreak/>
-        <w:t>Thread.sleep</w:t>
-      </w:r>
-      <w:proofErr w:type="spellEnd"/>
-      <w:r>
-        <w:rPr>
-          <w:sz w:val="28"/>
-          <w:szCs w:val="26"/>
-        </w:rPr>
-        <w:t>()</w:t>
+        <w:t>Thread.sleep()</w:t>
       </w:r>
     </w:p>
     <w:p>
@@ -1739,19 +1730,6 @@
           <w:szCs w:val="26"/>
         </w:rPr>
       </w:pPr>
-    </w:p>
-    <w:p>
-      <w:pPr>
-        <w:pStyle w:val="ListParagraph"/>
-        <w:numPr>
-          <w:ilvl w:val="1"/>
-          <w:numId w:val="1"/>
-        </w:numPr>
-        <w:rPr>
-          <w:sz w:val="28"/>
-          <w:szCs w:val="26"/>
-        </w:rPr>
-      </w:pPr>
       <w:r>
         <w:rPr>
           <w:sz w:val="28"/>
@@ -2197,27 +2175,27 @@
           <w:sz w:val="28"/>
           <w:szCs w:val="26"/>
         </w:rPr>
+        <w:t>Tags in Cucumber</w:t>
+      </w:r>
+    </w:p>
+    <w:p>
+      <w:pPr>
+        <w:pStyle w:val="ListParagraph"/>
+        <w:numPr>
+          <w:ilvl w:val="1"/>
+          <w:numId w:val="1"/>
+        </w:numPr>
+        <w:rPr>
+          <w:sz w:val="28"/>
+          <w:szCs w:val="26"/>
+        </w:rPr>
+      </w:pPr>
+      <w:r>
+        <w:rPr>
+          <w:sz w:val="28"/>
+          <w:szCs w:val="26"/>
+        </w:rPr>
         <w:lastRenderedPageBreak/>
-        <w:t>Tags in Cucumber</w:t>
-      </w:r>
-    </w:p>
-    <w:p>
-      <w:pPr>
-        <w:pStyle w:val="ListParagraph"/>
-        <w:numPr>
-          <w:ilvl w:val="1"/>
-          <w:numId w:val="1"/>
-        </w:numPr>
-        <w:rPr>
-          <w:sz w:val="28"/>
-          <w:szCs w:val="26"/>
-        </w:rPr>
-      </w:pPr>
-      <w:r>
-        <w:rPr>
-          <w:sz w:val="28"/>
-          <w:szCs w:val="26"/>
-        </w:rPr>
         <w:t>Hooks in Cucumber</w:t>
       </w:r>
     </w:p>
@@ -2253,6 +2231,26 @@
           <w:sz w:val="28"/>
           <w:szCs w:val="26"/>
         </w:rPr>
+        <w:br w:type="page"/>
+      </w:r>
+    </w:p>
+    <w:p>
+      <w:pPr>
+        <w:rPr>
+          <w:b/>
+          <w:bCs/>
+          <w:sz w:val="28"/>
+          <w:szCs w:val="26"/>
+        </w:rPr>
+      </w:pPr>
+      <w:r>
+        <w:rPr>
+          <w:b/>
+          <w:bCs/>
+          <w:sz w:val="28"/>
+          <w:szCs w:val="26"/>
+        </w:rPr>
+        <w:lastRenderedPageBreak/>
         <w:t>What is Software Testing?</w:t>
       </w:r>
     </w:p>
@@ -2275,23 +2273,7 @@
           <w:sz w:val="28"/>
           <w:szCs w:val="26"/>
         </w:rPr>
-        <w:t xml:space="preserve">Is a process of checking the Correctness, Completeness, </w:t>
-      </w:r>
-      <w:proofErr w:type="gramStart"/>
-      <w:r>
-        <w:rPr>
-          <w:sz w:val="28"/>
-          <w:szCs w:val="26"/>
-        </w:rPr>
-        <w:t>Security</w:t>
-      </w:r>
-      <w:proofErr w:type="gramEnd"/>
-      <w:r>
-        <w:rPr>
-          <w:sz w:val="28"/>
-          <w:szCs w:val="26"/>
-        </w:rPr>
-        <w:t xml:space="preserve"> &amp; Quality of developed software application. </w:t>
+        <w:t xml:space="preserve">Is a process of checking the Correctness, Completeness, Security &amp; Quality of developed software application. </w:t>
       </w:r>
     </w:p>
     <w:p>
@@ -2336,6 +2318,13 @@
         </w:rPr>
         <w:t>Requirements</w:t>
       </w:r>
+      <w:r>
+        <w:rPr>
+          <w:sz w:val="28"/>
+          <w:szCs w:val="26"/>
+        </w:rPr>
+        <w:t xml:space="preserve"> (SRS)</w:t>
+      </w:r>
     </w:p>
     <w:p>
       <w:pPr>
@@ -2414,7 +2403,7 @@
           <w:sz w:val="28"/>
           <w:szCs w:val="26"/>
         </w:rPr>
-        <w:t>Execute the test cases</w:t>
+        <w:t xml:space="preserve">Creating RTM </w:t>
       </w:r>
     </w:p>
     <w:p>
@@ -2434,6 +2423,26 @@
           <w:sz w:val="28"/>
           <w:szCs w:val="26"/>
         </w:rPr>
+        <w:t>Execute the test cases</w:t>
+      </w:r>
+    </w:p>
+    <w:p>
+      <w:pPr>
+        <w:pStyle w:val="ListParagraph"/>
+        <w:numPr>
+          <w:ilvl w:val="0"/>
+          <w:numId w:val="2"/>
+        </w:numPr>
+        <w:rPr>
+          <w:sz w:val="28"/>
+          <w:szCs w:val="26"/>
+        </w:rPr>
+      </w:pPr>
+      <w:r>
+        <w:rPr>
+          <w:sz w:val="28"/>
+          <w:szCs w:val="26"/>
+        </w:rPr>
         <w:t>Report</w:t>
       </w:r>
     </w:p>
@@ -2499,6 +2508,13 @@
         </w:rPr>
         <w:t>Navigation from one page to another</w:t>
       </w:r>
+      <w:r>
+        <w:rPr>
+          <w:sz w:val="28"/>
+          <w:szCs w:val="26"/>
+        </w:rPr>
+        <w:t xml:space="preserve"> using links</w:t>
+      </w:r>
     </w:p>
     <w:p>
       <w:pPr>
@@ -2713,7 +2729,6 @@
           <w:sz w:val="28"/>
           <w:szCs w:val="26"/>
         </w:rPr>
-        <w:lastRenderedPageBreak/>
         <w:t>Advantages of Automation</w:t>
       </w:r>
     </w:p>
@@ -2761,6 +2776,7 @@
           <w:sz w:val="28"/>
           <w:szCs w:val="26"/>
         </w:rPr>
+        <w:lastRenderedPageBreak/>
         <w:t>Regression Testing</w:t>
       </w:r>
     </w:p>
@@ -3234,7 +3250,6 @@
           <w:szCs w:val="26"/>
         </w:rPr>
       </w:pPr>
-      <w:proofErr w:type="spellStart"/>
       <w:r>
         <w:rPr>
           <w:sz w:val="28"/>
@@ -3242,7 +3257,6 @@
         </w:rPr>
         <w:t>RestAPI</w:t>
       </w:r>
-      <w:proofErr w:type="spellEnd"/>
     </w:p>
     <w:p>
       <w:pPr>
@@ -3380,7 +3394,18 @@
           <w:sz w:val="28"/>
           <w:szCs w:val="26"/>
         </w:rPr>
-        <w:t>Process of tool Automation</w:t>
+        <w:t xml:space="preserve">Process of </w:t>
+      </w:r>
+      <w:bookmarkStart w:id="0" w:name="_GoBack"/>
+      <w:bookmarkEnd w:id="0"/>
+      <w:r>
+        <w:rPr>
+          <w:b/>
+          <w:bCs/>
+          <w:sz w:val="28"/>
+          <w:szCs w:val="26"/>
+        </w:rPr>
+        <w:t>Automation</w:t>
       </w:r>
     </w:p>
     <w:p>
@@ -3400,7 +3425,6 @@
           <w:sz w:val="28"/>
           <w:szCs w:val="26"/>
         </w:rPr>
-        <w:lastRenderedPageBreak/>
         <w:t>Planning</w:t>
       </w:r>
     </w:p>
@@ -3441,6 +3465,7 @@
           <w:sz w:val="28"/>
           <w:szCs w:val="26"/>
         </w:rPr>
+        <w:lastRenderedPageBreak/>
         <w:t>The type of application that you are testing</w:t>
       </w:r>
     </w:p>
@@ -3456,8 +3481,6 @@
           <w:szCs w:val="26"/>
         </w:rPr>
       </w:pPr>
-      <w:bookmarkStart w:id="0" w:name="_GoBack"/>
-      <w:bookmarkEnd w:id="0"/>
     </w:p>
     <w:sectPr>
       <w:pgSz w:w="11906" w:h="16838"/>

</xml_diff>

<commit_message>
Date: 156 Oct 2026
</commit_message>
<xml_diff>
--- a/Selenium Notes.docx
+++ b/Selenium Notes.docx
@@ -721,22 +721,13 @@
           <w:szCs w:val="26"/>
         </w:rPr>
       </w:pPr>
-      <w:proofErr w:type="spellStart"/>
       <w:r>
         <w:rPr>
           <w:sz w:val="28"/>
           <w:szCs w:val="26"/>
         </w:rPr>
         <w:lastRenderedPageBreak/>
-        <w:t>Thread.sleep</w:t>
-      </w:r>
-      <w:proofErr w:type="spellEnd"/>
-      <w:r>
-        <w:rPr>
-          <w:sz w:val="28"/>
-          <w:szCs w:val="26"/>
-        </w:rPr>
-        <w:t>()</w:t>
+        <w:t>Thread.sleep()</w:t>
       </w:r>
     </w:p>
     <w:p>
@@ -2282,23 +2273,7 @@
           <w:sz w:val="28"/>
           <w:szCs w:val="26"/>
         </w:rPr>
-        <w:t xml:space="preserve">Is a process of checking the Correctness, Completeness, </w:t>
-      </w:r>
-      <w:proofErr w:type="gramStart"/>
-      <w:r>
-        <w:rPr>
-          <w:sz w:val="28"/>
-          <w:szCs w:val="26"/>
-        </w:rPr>
-        <w:t>Security</w:t>
-      </w:r>
-      <w:proofErr w:type="gramEnd"/>
-      <w:r>
-        <w:rPr>
-          <w:sz w:val="28"/>
-          <w:szCs w:val="26"/>
-        </w:rPr>
-        <w:t xml:space="preserve"> &amp; Quality of developed software application. </w:t>
+        <w:t xml:space="preserve">Is a process of checking the Correctness, Completeness, Security &amp; Quality of developed software application. </w:t>
       </w:r>
     </w:p>
     <w:p>
@@ -3275,7 +3250,6 @@
           <w:szCs w:val="26"/>
         </w:rPr>
       </w:pPr>
-      <w:proofErr w:type="spellStart"/>
       <w:r>
         <w:rPr>
           <w:sz w:val="28"/>
@@ -3283,7 +3257,6 @@
         </w:rPr>
         <w:t>RestAPI</w:t>
       </w:r>
-      <w:proofErr w:type="spellEnd"/>
     </w:p>
     <w:p>
       <w:pPr>
@@ -4240,6 +4213,13 @@
         </w:rPr>
         <w:t>Minimum JDK 11</w:t>
       </w:r>
+      <w:r>
+        <w:rPr>
+          <w:sz w:val="28"/>
+          <w:szCs w:val="26"/>
+        </w:rPr>
+        <w:t xml:space="preserve"> (Java 11)</w:t>
+      </w:r>
     </w:p>
     <w:p>
       <w:pPr>
@@ -4261,199 +4241,220 @@
         <w:t xml:space="preserve">Fire the command on Command Prompt </w:t>
       </w:r>
       <w:r>
-        <w:rPr>
-          <w:sz w:val="28"/>
-          <w:szCs w:val="26"/>
-        </w:rPr>
-        <w:t>Java –version</w:t>
-      </w:r>
-    </w:p>
-    <w:p>
-      <w:pPr>
-        <w:pStyle w:val="ListParagraph"/>
-        <w:numPr>
-          <w:ilvl w:val="0"/>
-          <w:numId w:val="11"/>
-        </w:numPr>
-        <w:rPr>
-          <w:sz w:val="28"/>
-          <w:szCs w:val="26"/>
-        </w:rPr>
-      </w:pPr>
-      <w:r>
-        <w:rPr>
-          <w:sz w:val="28"/>
-          <w:szCs w:val="26"/>
-        </w:rPr>
-        <w:t xml:space="preserve">IDE </w:t>
-      </w:r>
-    </w:p>
-    <w:p>
-      <w:pPr>
-        <w:pStyle w:val="ListParagraph"/>
-        <w:numPr>
-          <w:ilvl w:val="1"/>
-          <w:numId w:val="11"/>
-        </w:numPr>
-        <w:rPr>
-          <w:sz w:val="28"/>
-          <w:szCs w:val="26"/>
-        </w:rPr>
-      </w:pPr>
-      <w:r>
-        <w:rPr>
-          <w:sz w:val="28"/>
-          <w:szCs w:val="26"/>
-        </w:rPr>
-        <w:t>Eclipse</w:t>
-      </w:r>
-    </w:p>
-    <w:p>
-      <w:pPr>
-        <w:pStyle w:val="ListParagraph"/>
-        <w:numPr>
-          <w:ilvl w:val="1"/>
-          <w:numId w:val="11"/>
-        </w:numPr>
-        <w:rPr>
-          <w:sz w:val="28"/>
-          <w:szCs w:val="26"/>
-        </w:rPr>
-      </w:pPr>
-      <w:r>
-        <w:rPr>
-          <w:sz w:val="28"/>
-          <w:szCs w:val="26"/>
-        </w:rPr>
-        <w:t>VS Code</w:t>
-      </w:r>
-    </w:p>
-    <w:p>
-      <w:pPr>
-        <w:pStyle w:val="ListParagraph"/>
-        <w:numPr>
-          <w:ilvl w:val="1"/>
-          <w:numId w:val="11"/>
-        </w:numPr>
-        <w:rPr>
-          <w:sz w:val="28"/>
-          <w:szCs w:val="26"/>
-        </w:rPr>
-      </w:pPr>
-      <w:r>
-        <w:rPr>
-          <w:sz w:val="28"/>
-          <w:szCs w:val="26"/>
-        </w:rPr>
-        <w:t>Idea Intellij</w:t>
-      </w:r>
-    </w:p>
-    <w:p>
-      <w:pPr>
-        <w:pStyle w:val="ListParagraph"/>
-        <w:numPr>
-          <w:ilvl w:val="0"/>
-          <w:numId w:val="11"/>
-        </w:numPr>
-        <w:rPr>
-          <w:sz w:val="28"/>
-          <w:szCs w:val="26"/>
-        </w:rPr>
-      </w:pPr>
-      <w:r>
-        <w:rPr>
-          <w:sz w:val="28"/>
-          <w:szCs w:val="26"/>
-        </w:rPr>
-        <w:t>Selenium WebDriver Jar file</w:t>
-      </w:r>
-    </w:p>
-    <w:p>
-      <w:pPr>
-        <w:pStyle w:val="ListParagraph"/>
-        <w:numPr>
-          <w:ilvl w:val="0"/>
-          <w:numId w:val="11"/>
-        </w:numPr>
-        <w:rPr>
-          <w:sz w:val="28"/>
-          <w:szCs w:val="26"/>
-        </w:rPr>
-      </w:pPr>
-      <w:r>
-        <w:rPr>
-          <w:sz w:val="28"/>
-          <w:szCs w:val="26"/>
-        </w:rPr>
-        <w:t>Let’s create 2 folders with name</w:t>
-      </w:r>
-    </w:p>
-    <w:p>
-      <w:pPr>
-        <w:pStyle w:val="ListParagraph"/>
-        <w:numPr>
-          <w:ilvl w:val="1"/>
-          <w:numId w:val="11"/>
-        </w:numPr>
-        <w:rPr>
-          <w:sz w:val="28"/>
-          <w:szCs w:val="26"/>
-        </w:rPr>
-      </w:pPr>
-      <w:proofErr w:type="spellStart"/>
-      <w:r>
-        <w:rPr>
-          <w:sz w:val="28"/>
-          <w:szCs w:val="26"/>
-        </w:rPr>
-        <w:t>YourName_SeleniumDemos</w:t>
-      </w:r>
-      <w:proofErr w:type="spellEnd"/>
-    </w:p>
-    <w:p>
-      <w:pPr>
-        <w:pStyle w:val="ListParagraph"/>
-        <w:numPr>
-          <w:ilvl w:val="1"/>
-          <w:numId w:val="11"/>
-        </w:numPr>
-        <w:rPr>
-          <w:sz w:val="28"/>
-          <w:szCs w:val="26"/>
-        </w:rPr>
-      </w:pPr>
-      <w:r>
-        <w:rPr>
-          <w:sz w:val="28"/>
-          <w:szCs w:val="26"/>
-        </w:rPr>
-        <w:t>Selenium Jar Files</w:t>
-      </w:r>
-    </w:p>
-    <w:p>
-      <w:pPr>
-        <w:rPr>
-          <w:sz w:val="28"/>
-          <w:szCs w:val="26"/>
-        </w:rPr>
-      </w:pPr>
-    </w:p>
-    <w:p>
-      <w:pPr>
         <w:rPr>
           <w:b/>
           <w:bCs/>
           <w:sz w:val="28"/>
           <w:szCs w:val="26"/>
         </w:rPr>
-      </w:pPr>
-      <w:r>
+        <w:t>Java –version</w:t>
+      </w:r>
+    </w:p>
+    <w:p>
+      <w:pPr>
+        <w:pStyle w:val="ListParagraph"/>
+        <w:numPr>
+          <w:ilvl w:val="0"/>
+          <w:numId w:val="11"/>
+        </w:numPr>
+        <w:rPr>
+          <w:sz w:val="28"/>
+          <w:szCs w:val="26"/>
+        </w:rPr>
+      </w:pPr>
+      <w:r>
+        <w:rPr>
+          <w:sz w:val="28"/>
+          <w:szCs w:val="26"/>
+        </w:rPr>
+        <w:t xml:space="preserve">IDE </w:t>
+      </w:r>
+    </w:p>
+    <w:p>
+      <w:pPr>
+        <w:pStyle w:val="ListParagraph"/>
+        <w:numPr>
+          <w:ilvl w:val="1"/>
+          <w:numId w:val="11"/>
+        </w:numPr>
+        <w:rPr>
+          <w:sz w:val="28"/>
+          <w:szCs w:val="26"/>
+        </w:rPr>
+      </w:pPr>
+      <w:r>
+        <w:rPr>
+          <w:sz w:val="28"/>
+          <w:szCs w:val="26"/>
+        </w:rPr>
+        <w:t>Eclipse</w:t>
+      </w:r>
+    </w:p>
+    <w:p>
+      <w:pPr>
+        <w:pStyle w:val="ListParagraph"/>
+        <w:numPr>
+          <w:ilvl w:val="1"/>
+          <w:numId w:val="11"/>
+        </w:numPr>
+        <w:rPr>
+          <w:sz w:val="28"/>
+          <w:szCs w:val="26"/>
+        </w:rPr>
+      </w:pPr>
+      <w:r>
+        <w:rPr>
+          <w:sz w:val="28"/>
+          <w:szCs w:val="26"/>
+        </w:rPr>
+        <w:t>VS Code</w:t>
+      </w:r>
+    </w:p>
+    <w:p>
+      <w:pPr>
+        <w:pStyle w:val="ListParagraph"/>
+        <w:numPr>
+          <w:ilvl w:val="1"/>
+          <w:numId w:val="11"/>
+        </w:numPr>
+        <w:rPr>
+          <w:sz w:val="28"/>
+          <w:szCs w:val="26"/>
+        </w:rPr>
+      </w:pPr>
+      <w:r>
+        <w:rPr>
+          <w:sz w:val="28"/>
+          <w:szCs w:val="26"/>
+        </w:rPr>
+        <w:t>Idea Intellij</w:t>
+      </w:r>
+    </w:p>
+    <w:p>
+      <w:pPr>
+        <w:pStyle w:val="ListParagraph"/>
+        <w:numPr>
+          <w:ilvl w:val="0"/>
+          <w:numId w:val="11"/>
+        </w:numPr>
+        <w:rPr>
+          <w:sz w:val="28"/>
+          <w:szCs w:val="26"/>
+        </w:rPr>
+      </w:pPr>
+      <w:r>
+        <w:rPr>
+          <w:sz w:val="28"/>
+          <w:szCs w:val="26"/>
+        </w:rPr>
+        <w:t>Selenium WebDriver Jar file</w:t>
+      </w:r>
+    </w:p>
+    <w:p>
+      <w:pPr>
+        <w:pStyle w:val="ListParagraph"/>
+        <w:numPr>
+          <w:ilvl w:val="0"/>
+          <w:numId w:val="11"/>
+        </w:numPr>
+        <w:rPr>
+          <w:sz w:val="28"/>
+          <w:szCs w:val="26"/>
+        </w:rPr>
+      </w:pPr>
+      <w:r>
+        <w:rPr>
+          <w:sz w:val="28"/>
+          <w:szCs w:val="26"/>
+        </w:rPr>
+        <w:t>Let’s create 2 folders with name</w:t>
+      </w:r>
+    </w:p>
+    <w:p>
+      <w:pPr>
+        <w:pStyle w:val="ListParagraph"/>
+        <w:numPr>
+          <w:ilvl w:val="1"/>
+          <w:numId w:val="11"/>
+        </w:numPr>
+        <w:rPr>
+          <w:sz w:val="28"/>
+          <w:szCs w:val="26"/>
+        </w:rPr>
+      </w:pPr>
+      <w:r>
+        <w:rPr>
+          <w:sz w:val="28"/>
+          <w:szCs w:val="26"/>
+        </w:rPr>
+        <w:t>YourName_SeleniumDemos</w:t>
+      </w:r>
+      <w:r>
+        <w:rPr>
+          <w:sz w:val="28"/>
+          <w:szCs w:val="26"/>
+        </w:rPr>
+        <w:t xml:space="preserve"> </w:t>
+      </w:r>
+      <w:r>
+        <w:rPr>
+          <w:sz w:val="28"/>
+          <w:szCs w:val="26"/>
+        </w:rPr>
+        <w:sym w:font="Wingdings" w:char="F0E0"/>
+      </w:r>
+      <w:r>
+        <w:rPr>
+          <w:sz w:val="28"/>
+          <w:szCs w:val="26"/>
+        </w:rPr>
+        <w:t xml:space="preserve"> To store all the demos</w:t>
+      </w:r>
+    </w:p>
+    <w:p>
+      <w:pPr>
+        <w:pStyle w:val="ListParagraph"/>
+        <w:numPr>
+          <w:ilvl w:val="1"/>
+          <w:numId w:val="11"/>
+        </w:numPr>
+        <w:rPr>
+          <w:sz w:val="28"/>
+          <w:szCs w:val="26"/>
+        </w:rPr>
+      </w:pPr>
+      <w:r>
+        <w:rPr>
+          <w:sz w:val="28"/>
+          <w:szCs w:val="26"/>
+        </w:rPr>
+        <w:t>Selenium-To store all the supported files (Jar Files)</w:t>
+      </w:r>
+    </w:p>
+    <w:p>
+      <w:pPr>
+        <w:rPr>
+          <w:sz w:val="28"/>
+          <w:szCs w:val="26"/>
+        </w:rPr>
+      </w:pPr>
+    </w:p>
+    <w:p>
+      <w:pPr>
         <w:rPr>
           <w:b/>
           <w:bCs/>
           <w:sz w:val="28"/>
           <w:szCs w:val="26"/>
         </w:rPr>
+      </w:pPr>
+      <w:r>
+        <w:rPr>
+          <w:b/>
+          <w:bCs/>
+          <w:sz w:val="28"/>
+          <w:szCs w:val="26"/>
+        </w:rPr>
         <w:t>Configuration</w:t>
       </w:r>
     </w:p>
@@ -4474,23 +4475,7 @@
           <w:sz w:val="28"/>
           <w:szCs w:val="26"/>
         </w:rPr>
-        <w:t xml:space="preserve">Open </w:t>
-      </w:r>
-      <w:proofErr w:type="spellStart"/>
-      <w:r>
-        <w:rPr>
-          <w:sz w:val="28"/>
-          <w:szCs w:val="26"/>
-        </w:rPr>
-        <w:t>selenium.dev</w:t>
-      </w:r>
-      <w:proofErr w:type="spellEnd"/>
-      <w:r>
-        <w:rPr>
-          <w:sz w:val="28"/>
-          <w:szCs w:val="26"/>
-        </w:rPr>
-        <w:t xml:space="preserve"> site</w:t>
+        <w:t>Open selenium.dev site</w:t>
       </w:r>
     </w:p>
     <w:p>
@@ -4538,15 +4523,7 @@
           <w:color w:val="343A40"/>
           <w:shd w:val="clear" w:color="auto" w:fill="FFFFFF"/>
         </w:rPr>
-        <w:t xml:space="preserve"> - </w:t>
-      </w:r>
-      <w:r>
-        <w:rPr>
-          <w:rFonts w:ascii="Segoe UI" w:hAnsi="Segoe UI" w:cs="Segoe UI"/>
-          <w:color w:val="343A40"/>
-          <w:shd w:val="clear" w:color="auto" w:fill="FFFFFF"/>
-        </w:rPr>
-        <w:t xml:space="preserve">Latest stable version </w:t>
+        <w:t xml:space="preserve"> - Latest stable version </w:t>
       </w:r>
       <w:hyperlink r:id="rId5" w:history="1">
         <w:r>
@@ -4631,7 +4608,28 @@
           <w:sz w:val="28"/>
           <w:szCs w:val="26"/>
         </w:rPr>
-        <w:t xml:space="preserve"> folder which we have created in earlier step (Pre-requisite) Selenium Jar Files</w:t>
+        <w:t xml:space="preserve"> folder which we have created </w:t>
+      </w:r>
+      <w:r>
+        <w:rPr>
+          <w:sz w:val="28"/>
+          <w:szCs w:val="26"/>
+        </w:rPr>
+        <w:t xml:space="preserve">in earlier step (Pre-requisite - </w:t>
+      </w:r>
+      <w:r>
+        <w:rPr>
+          <w:sz w:val="28"/>
+          <w:szCs w:val="26"/>
+        </w:rPr>
+        <w:t>Selenium Jar Files</w:t>
+      </w:r>
+      <w:r>
+        <w:rPr>
+          <w:sz w:val="28"/>
+          <w:szCs w:val="26"/>
+        </w:rPr>
+        <w:t>)</w:t>
       </w:r>
     </w:p>
     <w:p>
@@ -4686,23 +4684,7 @@
           <w:sz w:val="28"/>
           <w:szCs w:val="26"/>
         </w:rPr>
-        <w:t xml:space="preserve"> folder (</w:t>
-      </w:r>
-      <w:proofErr w:type="spellStart"/>
-      <w:r>
-        <w:rPr>
-          <w:sz w:val="28"/>
-          <w:szCs w:val="26"/>
-        </w:rPr>
-        <w:t>YourName_SeleniumDemos</w:t>
-      </w:r>
-      <w:proofErr w:type="spellEnd"/>
-      <w:r>
-        <w:rPr>
-          <w:sz w:val="28"/>
-          <w:szCs w:val="26"/>
-        </w:rPr>
-        <w:t xml:space="preserve">) as a workspace </w:t>
+        <w:t xml:space="preserve"> folder (YourName_SeleniumDemos) as a workspace </w:t>
       </w:r>
     </w:p>
     <w:p>
@@ -4913,23 +4895,7 @@
           <w:sz w:val="28"/>
           <w:szCs w:val="26"/>
         </w:rPr>
-        <w:t xml:space="preserve">Create a package inside the project (Specially in </w:t>
-      </w:r>
-      <w:proofErr w:type="spellStart"/>
-      <w:r>
-        <w:rPr>
-          <w:sz w:val="28"/>
-          <w:szCs w:val="26"/>
-        </w:rPr>
-        <w:t>src</w:t>
-      </w:r>
-      <w:proofErr w:type="spellEnd"/>
-      <w:r>
-        <w:rPr>
-          <w:sz w:val="28"/>
-          <w:szCs w:val="26"/>
-        </w:rPr>
-        <w:t xml:space="preserve"> folder)</w:t>
+        <w:t>Create a package inside the project (Specially in src folder)</w:t>
       </w:r>
     </w:p>
     <w:p>
@@ -4964,8 +4930,686 @@
           <w:szCs w:val="26"/>
         </w:rPr>
       </w:pPr>
+      <w:r>
+        <w:rPr>
+          <w:b/>
+          <w:bCs/>
+          <w:sz w:val="28"/>
+          <w:szCs w:val="26"/>
+        </w:rPr>
+        <w:t>Selenium WebDriver Configuration</w:t>
+      </w:r>
+    </w:p>
+    <w:p>
+      <w:pPr>
+        <w:pStyle w:val="ListParagraph"/>
+        <w:numPr>
+          <w:ilvl w:val="1"/>
+          <w:numId w:val="13"/>
+        </w:numPr>
+        <w:rPr>
+          <w:sz w:val="28"/>
+          <w:szCs w:val="26"/>
+        </w:rPr>
+      </w:pPr>
+      <w:r>
+        <w:rPr>
+          <w:sz w:val="28"/>
+          <w:szCs w:val="26"/>
+        </w:rPr>
+        <w:t>Right click on you project (from package explorer)</w:t>
+      </w:r>
+    </w:p>
+    <w:p>
+      <w:pPr>
+        <w:pStyle w:val="ListParagraph"/>
+        <w:numPr>
+          <w:ilvl w:val="1"/>
+          <w:numId w:val="13"/>
+        </w:numPr>
+        <w:rPr>
+          <w:sz w:val="28"/>
+          <w:szCs w:val="26"/>
+        </w:rPr>
+      </w:pPr>
+      <w:r>
+        <w:rPr>
+          <w:sz w:val="28"/>
+          <w:szCs w:val="26"/>
+        </w:rPr>
+        <w:t xml:space="preserve">Go to </w:t>
+      </w:r>
+      <w:r>
+        <w:rPr>
+          <w:b/>
+          <w:bCs/>
+          <w:sz w:val="28"/>
+          <w:szCs w:val="26"/>
+        </w:rPr>
+        <w:t>Build Path</w:t>
+      </w:r>
+      <w:r>
+        <w:rPr>
+          <w:sz w:val="28"/>
+          <w:szCs w:val="26"/>
+        </w:rPr>
+        <w:t xml:space="preserve"> menu</w:t>
+      </w:r>
+    </w:p>
+    <w:p>
+      <w:pPr>
+        <w:pStyle w:val="ListParagraph"/>
+        <w:numPr>
+          <w:ilvl w:val="1"/>
+          <w:numId w:val="13"/>
+        </w:numPr>
+        <w:rPr>
+          <w:sz w:val="28"/>
+          <w:szCs w:val="26"/>
+        </w:rPr>
+      </w:pPr>
+      <w:r>
+        <w:rPr>
+          <w:sz w:val="28"/>
+          <w:szCs w:val="26"/>
+        </w:rPr>
+        <w:t xml:space="preserve">Click on </w:t>
+      </w:r>
+      <w:r>
+        <w:rPr>
+          <w:b/>
+          <w:bCs/>
+          <w:sz w:val="28"/>
+          <w:szCs w:val="26"/>
+        </w:rPr>
+        <w:t>Configure Build Path…</w:t>
+      </w:r>
+    </w:p>
+    <w:p>
+      <w:pPr>
+        <w:pStyle w:val="ListParagraph"/>
+        <w:numPr>
+          <w:ilvl w:val="1"/>
+          <w:numId w:val="13"/>
+        </w:numPr>
+        <w:rPr>
+          <w:sz w:val="28"/>
+          <w:szCs w:val="26"/>
+        </w:rPr>
+      </w:pPr>
+      <w:r>
+        <w:rPr>
+          <w:sz w:val="28"/>
+          <w:szCs w:val="26"/>
+        </w:rPr>
+        <w:t xml:space="preserve">Click on </w:t>
+      </w:r>
+      <w:r>
+        <w:rPr>
+          <w:b/>
+          <w:bCs/>
+          <w:sz w:val="28"/>
+          <w:szCs w:val="26"/>
+        </w:rPr>
+        <w:t xml:space="preserve">Library </w:t>
+      </w:r>
+      <w:r>
+        <w:rPr>
+          <w:sz w:val="28"/>
+          <w:szCs w:val="26"/>
+        </w:rPr>
+        <w:t>tab</w:t>
+      </w:r>
+    </w:p>
+    <w:p>
+      <w:pPr>
+        <w:pStyle w:val="ListParagraph"/>
+        <w:numPr>
+          <w:ilvl w:val="1"/>
+          <w:numId w:val="13"/>
+        </w:numPr>
+        <w:rPr>
+          <w:sz w:val="28"/>
+          <w:szCs w:val="26"/>
+        </w:rPr>
+      </w:pPr>
+      <w:r>
+        <w:rPr>
+          <w:sz w:val="28"/>
+          <w:szCs w:val="26"/>
+        </w:rPr>
+        <w:t xml:space="preserve">Click on </w:t>
+      </w:r>
+      <w:r>
+        <w:rPr>
+          <w:b/>
+          <w:bCs/>
+          <w:sz w:val="28"/>
+          <w:szCs w:val="26"/>
+        </w:rPr>
+        <w:t xml:space="preserve">classpath </w:t>
+      </w:r>
+    </w:p>
+    <w:p>
+      <w:pPr>
+        <w:pStyle w:val="ListParagraph"/>
+        <w:numPr>
+          <w:ilvl w:val="1"/>
+          <w:numId w:val="13"/>
+        </w:numPr>
+        <w:rPr>
+          <w:sz w:val="28"/>
+          <w:szCs w:val="26"/>
+        </w:rPr>
+      </w:pPr>
+      <w:r>
+        <w:rPr>
+          <w:sz w:val="28"/>
+          <w:szCs w:val="26"/>
+        </w:rPr>
+        <w:t xml:space="preserve">Click on </w:t>
+      </w:r>
+      <w:r>
+        <w:rPr>
+          <w:b/>
+          <w:bCs/>
+          <w:sz w:val="28"/>
+          <w:szCs w:val="26"/>
+        </w:rPr>
+        <w:t>Add External Jars…</w:t>
+      </w:r>
+      <w:r>
+        <w:rPr>
+          <w:sz w:val="28"/>
+          <w:szCs w:val="26"/>
+        </w:rPr>
+        <w:t xml:space="preserve"> button</w:t>
+      </w:r>
+    </w:p>
+    <w:p>
+      <w:pPr>
+        <w:pStyle w:val="ListParagraph"/>
+        <w:numPr>
+          <w:ilvl w:val="1"/>
+          <w:numId w:val="13"/>
+        </w:numPr>
+        <w:rPr>
+          <w:sz w:val="28"/>
+          <w:szCs w:val="26"/>
+        </w:rPr>
+      </w:pPr>
+      <w:r>
+        <w:rPr>
+          <w:sz w:val="28"/>
+          <w:szCs w:val="26"/>
+        </w:rPr>
+        <w:t>Select the 2</w:t>
+      </w:r>
+      <w:r>
+        <w:rPr>
+          <w:sz w:val="28"/>
+          <w:szCs w:val="26"/>
+          <w:vertAlign w:val="superscript"/>
+        </w:rPr>
+        <w:t>nd</w:t>
+      </w:r>
+      <w:r>
+        <w:rPr>
+          <w:sz w:val="28"/>
+          <w:szCs w:val="26"/>
+        </w:rPr>
+        <w:t xml:space="preserve"> folder (Selenium Jar Files)</w:t>
+      </w:r>
+    </w:p>
+    <w:p>
+      <w:pPr>
+        <w:pStyle w:val="ListParagraph"/>
+        <w:numPr>
+          <w:ilvl w:val="1"/>
+          <w:numId w:val="13"/>
+        </w:numPr>
+        <w:rPr>
+          <w:sz w:val="28"/>
+          <w:szCs w:val="26"/>
+        </w:rPr>
+      </w:pPr>
+      <w:r>
+        <w:rPr>
+          <w:sz w:val="28"/>
+          <w:szCs w:val="26"/>
+        </w:rPr>
+        <w:t>Select the file which we have downloaded in earlier steps</w:t>
+      </w:r>
+    </w:p>
+    <w:p>
+      <w:pPr>
+        <w:pStyle w:val="ListParagraph"/>
+        <w:numPr>
+          <w:ilvl w:val="1"/>
+          <w:numId w:val="13"/>
+        </w:numPr>
+        <w:rPr>
+          <w:sz w:val="28"/>
+          <w:szCs w:val="26"/>
+        </w:rPr>
+      </w:pPr>
+      <w:r>
+        <w:rPr>
+          <w:sz w:val="28"/>
+          <w:szCs w:val="26"/>
+        </w:rPr>
+        <w:t xml:space="preserve">Click on </w:t>
+      </w:r>
+      <w:r>
+        <w:rPr>
+          <w:b/>
+          <w:bCs/>
+          <w:sz w:val="28"/>
+          <w:szCs w:val="26"/>
+        </w:rPr>
+        <w:t xml:space="preserve">Open </w:t>
+      </w:r>
+      <w:r>
+        <w:rPr>
+          <w:sz w:val="28"/>
+          <w:szCs w:val="26"/>
+        </w:rPr>
+        <w:t>button</w:t>
+      </w:r>
+    </w:p>
+    <w:p>
+      <w:pPr>
+        <w:pStyle w:val="ListParagraph"/>
+        <w:numPr>
+          <w:ilvl w:val="1"/>
+          <w:numId w:val="13"/>
+        </w:numPr>
+        <w:rPr>
+          <w:sz w:val="28"/>
+          <w:szCs w:val="26"/>
+        </w:rPr>
+      </w:pPr>
+      <w:r>
+        <w:rPr>
+          <w:sz w:val="28"/>
+          <w:szCs w:val="26"/>
+        </w:rPr>
+        <w:t xml:space="preserve">Click on </w:t>
+      </w:r>
+      <w:r>
+        <w:rPr>
+          <w:b/>
+          <w:bCs/>
+          <w:sz w:val="28"/>
+          <w:szCs w:val="26"/>
+        </w:rPr>
+        <w:t xml:space="preserve">Apply and Close </w:t>
+      </w:r>
+      <w:r>
+        <w:rPr>
+          <w:sz w:val="28"/>
+          <w:szCs w:val="26"/>
+        </w:rPr>
+        <w:t>button</w:t>
+      </w:r>
+    </w:p>
+    <w:p>
+      <w:pPr>
+        <w:rPr>
+          <w:sz w:val="28"/>
+          <w:szCs w:val="26"/>
+        </w:rPr>
+      </w:pPr>
+      <w:r>
+        <w:rPr>
+          <w:sz w:val="28"/>
+          <w:szCs w:val="26"/>
+        </w:rPr>
+        <w:br w:type="page"/>
+      </w:r>
+    </w:p>
+    <w:p>
+      <w:pPr>
+        <w:rPr>
+          <w:b/>
+          <w:bCs/>
+          <w:sz w:val="28"/>
+          <w:szCs w:val="26"/>
+        </w:rPr>
+      </w:pPr>
+      <w:r>
+        <w:rPr>
+          <w:b/>
+          <w:bCs/>
+          <w:sz w:val="28"/>
+          <w:szCs w:val="26"/>
+        </w:rPr>
+        <w:lastRenderedPageBreak/>
+        <w:t>Selenium Methods</w:t>
+      </w:r>
+    </w:p>
+    <w:p>
+      <w:pPr>
+        <w:pStyle w:val="ListParagraph"/>
+        <w:numPr>
+          <w:ilvl w:val="0"/>
+          <w:numId w:val="14"/>
+        </w:numPr>
+        <w:rPr>
+          <w:sz w:val="28"/>
+          <w:szCs w:val="26"/>
+        </w:rPr>
+      </w:pPr>
+      <w:r>
+        <w:rPr>
+          <w:sz w:val="28"/>
+          <w:szCs w:val="26"/>
+        </w:rPr>
+        <w:t xml:space="preserve">Launching the browser </w:t>
+      </w:r>
+      <w:r>
+        <w:rPr>
+          <w:sz w:val="28"/>
+          <w:szCs w:val="26"/>
+        </w:rPr>
+        <w:sym w:font="Wingdings" w:char="F0E0"/>
+      </w:r>
+      <w:r>
+        <w:rPr>
+          <w:sz w:val="28"/>
+          <w:szCs w:val="26"/>
+        </w:rPr>
+        <w:t xml:space="preserve"> Create object of WebDriver interface, it will launch the blank browser window.</w:t>
+      </w:r>
+    </w:p>
+    <w:p>
+      <w:pPr>
+        <w:pStyle w:val="ListParagraph"/>
+        <w:numPr>
+          <w:ilvl w:val="0"/>
+          <w:numId w:val="14"/>
+        </w:numPr>
+        <w:rPr>
+          <w:sz w:val="28"/>
+          <w:szCs w:val="26"/>
+        </w:rPr>
+      </w:pPr>
+      <w:r>
+        <w:rPr>
+          <w:sz w:val="28"/>
+          <w:szCs w:val="26"/>
+        </w:rPr>
+        <w:t xml:space="preserve">get() </w:t>
+      </w:r>
+      <w:r>
+        <w:rPr>
+          <w:sz w:val="28"/>
+          <w:szCs w:val="26"/>
+        </w:rPr>
+        <w:sym w:font="Wingdings" w:char="F0E0"/>
+      </w:r>
+      <w:r>
+        <w:rPr>
+          <w:sz w:val="28"/>
+          <w:szCs w:val="26"/>
+        </w:rPr>
+        <w:t xml:space="preserve"> Will open the web site by providing the URL. Pass the absolute URL. Absolute URL starts with http</w:t>
+      </w:r>
+    </w:p>
+    <w:p>
+      <w:pPr>
+        <w:pStyle w:val="ListParagraph"/>
+        <w:numPr>
+          <w:ilvl w:val="0"/>
+          <w:numId w:val="14"/>
+        </w:numPr>
+        <w:rPr>
+          <w:sz w:val="28"/>
+          <w:szCs w:val="26"/>
+        </w:rPr>
+      </w:pPr>
+      <w:r>
+        <w:rPr>
+          <w:sz w:val="28"/>
+          <w:szCs w:val="26"/>
+        </w:rPr>
+        <w:t xml:space="preserve">close() </w:t>
+      </w:r>
+      <w:r>
+        <w:rPr>
+          <w:sz w:val="28"/>
+          <w:szCs w:val="26"/>
+        </w:rPr>
+        <w:sym w:font="Wingdings" w:char="F0E0"/>
+      </w:r>
+      <w:r>
+        <w:rPr>
+          <w:sz w:val="28"/>
+          <w:szCs w:val="26"/>
+        </w:rPr>
+        <w:t xml:space="preserve"> Will close the browser window which is opened by current WebDriver object</w:t>
+      </w:r>
+      <w:r>
+        <w:rPr>
+          <w:sz w:val="28"/>
+          <w:szCs w:val="26"/>
+        </w:rPr>
+        <w:t>.</w:t>
+      </w:r>
+    </w:p>
+    <w:p>
+      <w:pPr>
+        <w:pStyle w:val="ListParagraph"/>
+        <w:numPr>
+          <w:ilvl w:val="0"/>
+          <w:numId w:val="14"/>
+        </w:numPr>
+        <w:rPr>
+          <w:sz w:val="28"/>
+          <w:szCs w:val="26"/>
+        </w:rPr>
+      </w:pPr>
+      <w:r>
+        <w:rPr>
+          <w:sz w:val="28"/>
+          <w:szCs w:val="26"/>
+        </w:rPr>
+        <w:t xml:space="preserve">driver.manage().windows().maximize() </w:t>
+      </w:r>
+      <w:r>
+        <w:rPr>
+          <w:sz w:val="28"/>
+          <w:szCs w:val="26"/>
+        </w:rPr>
+        <w:sym w:font="Wingdings" w:char="F0E0"/>
+      </w:r>
+      <w:r>
+        <w:rPr>
+          <w:sz w:val="28"/>
+          <w:szCs w:val="26"/>
+        </w:rPr>
+        <w:t xml:space="preserve"> Will maximize the browser window.</w:t>
+      </w:r>
+    </w:p>
+    <w:p>
+      <w:pPr>
+        <w:pStyle w:val="ListParagraph"/>
+        <w:numPr>
+          <w:ilvl w:val="0"/>
+          <w:numId w:val="14"/>
+        </w:numPr>
+        <w:rPr>
+          <w:sz w:val="28"/>
+          <w:szCs w:val="26"/>
+        </w:rPr>
+      </w:pPr>
+      <w:r>
+        <w:rPr>
+          <w:sz w:val="28"/>
+          <w:szCs w:val="26"/>
+        </w:rPr>
+        <w:t xml:space="preserve">getTitle() </w:t>
+      </w:r>
+      <w:r>
+        <w:rPr>
+          <w:sz w:val="28"/>
+          <w:szCs w:val="26"/>
+        </w:rPr>
+        <w:sym w:font="Wingdings" w:char="F0E0"/>
+      </w:r>
+      <w:r>
+        <w:rPr>
+          <w:sz w:val="28"/>
+          <w:szCs w:val="26"/>
+        </w:rPr>
+        <w:t xml:space="preserve"> </w:t>
+      </w:r>
+      <w:r>
+        <w:rPr>
+          <w:sz w:val="28"/>
+          <w:szCs w:val="26"/>
+        </w:rPr>
+        <w:t>Will return the title of the web page. (String)</w:t>
+      </w:r>
+    </w:p>
+    <w:p>
+      <w:pPr>
+        <w:pStyle w:val="ListParagraph"/>
+        <w:numPr>
+          <w:ilvl w:val="0"/>
+          <w:numId w:val="14"/>
+        </w:numPr>
+        <w:rPr>
+          <w:sz w:val="28"/>
+          <w:szCs w:val="26"/>
+        </w:rPr>
+      </w:pPr>
+      <w:r>
+        <w:rPr>
+          <w:sz w:val="28"/>
+          <w:szCs w:val="26"/>
+        </w:rPr>
+        <w:t xml:space="preserve">getCurrentUrl() </w:t>
+      </w:r>
+      <w:r>
+        <w:rPr>
+          <w:sz w:val="28"/>
+          <w:szCs w:val="26"/>
+        </w:rPr>
+        <w:sym w:font="Wingdings" w:char="F0E0"/>
+      </w:r>
+      <w:r>
+        <w:rPr>
+          <w:sz w:val="28"/>
+          <w:szCs w:val="26"/>
+        </w:rPr>
+        <w:t xml:space="preserve"> Will return the URL of the current web page. (String)</w:t>
+      </w:r>
       <w:bookmarkStart w:id="0" w:name="_GoBack"/>
       <w:bookmarkEnd w:id="0"/>
+    </w:p>
+    <w:p>
+      <w:pPr>
+        <w:rPr>
+          <w:sz w:val="28"/>
+          <w:szCs w:val="26"/>
+        </w:rPr>
+      </w:pPr>
+    </w:p>
+    <w:p>
+      <w:pPr>
+        <w:rPr>
+          <w:sz w:val="28"/>
+          <w:szCs w:val="26"/>
+        </w:rPr>
+      </w:pPr>
+    </w:p>
+    <w:p>
+      <w:pPr>
+        <w:rPr>
+          <w:b/>
+          <w:bCs/>
+          <w:sz w:val="28"/>
+          <w:szCs w:val="26"/>
+        </w:rPr>
+      </w:pPr>
+      <w:r>
+        <w:rPr>
+          <w:b/>
+          <w:bCs/>
+          <w:sz w:val="28"/>
+          <w:szCs w:val="26"/>
+        </w:rPr>
+        <w:t>Common Exceptions in WebDriver</w:t>
+      </w:r>
+    </w:p>
+    <w:p>
+      <w:pPr>
+        <w:pStyle w:val="ListParagraph"/>
+        <w:numPr>
+          <w:ilvl w:val="0"/>
+          <w:numId w:val="15"/>
+        </w:numPr>
+        <w:rPr>
+          <w:sz w:val="28"/>
+          <w:szCs w:val="26"/>
+        </w:rPr>
+      </w:pPr>
+      <w:r>
+        <w:rPr>
+          <w:sz w:val="28"/>
+          <w:szCs w:val="26"/>
+        </w:rPr>
+        <w:t xml:space="preserve">InvalidArgumentException </w:t>
+      </w:r>
+      <w:r>
+        <w:rPr>
+          <w:sz w:val="28"/>
+          <w:szCs w:val="26"/>
+        </w:rPr>
+        <w:sym w:font="Wingdings" w:char="F0E0"/>
+      </w:r>
+      <w:r>
+        <w:rPr>
+          <w:sz w:val="28"/>
+          <w:szCs w:val="26"/>
+        </w:rPr>
+        <w:t xml:space="preserve"> The URL which is passed in .get() is not in the correct format. </w:t>
+      </w:r>
+    </w:p>
+    <w:p>
+      <w:pPr>
+        <w:pStyle w:val="ListParagraph"/>
+        <w:numPr>
+          <w:ilvl w:val="0"/>
+          <w:numId w:val="15"/>
+        </w:numPr>
+        <w:rPr>
+          <w:sz w:val="28"/>
+          <w:szCs w:val="26"/>
+        </w:rPr>
+      </w:pPr>
+      <w:r>
+        <w:rPr>
+          <w:sz w:val="28"/>
+          <w:szCs w:val="26"/>
+        </w:rPr>
+        <w:t xml:space="preserve">NoSuchSessionException </w:t>
+      </w:r>
+      <w:r>
+        <w:rPr>
+          <w:sz w:val="28"/>
+          <w:szCs w:val="26"/>
+        </w:rPr>
+        <w:sym w:font="Wingdings" w:char="F0E0"/>
+      </w:r>
+      <w:r>
+        <w:rPr>
+          <w:sz w:val="28"/>
+          <w:szCs w:val="26"/>
+        </w:rPr>
+        <w:t xml:space="preserve"> Selenium WebDriver has closed the browser (session) and still you are trying to perform some actions.</w:t>
+      </w:r>
     </w:p>
     <w:sectPr>
       <w:pgSz w:w="11906" w:h="16838"/>
@@ -5559,6 +6203,95 @@
     </w:lvl>
   </w:abstractNum>
   <w:abstractNum w:abstractNumId="6">
+    <w:nsid w:val="20D129B6"/>
+    <w:multiLevelType w:val="hybridMultilevel"/>
+    <w:tmpl w:val="64464EB2"/>
+    <w:lvl w:ilvl="0" w:tplc="4009000F">
+      <w:start w:val="1"/>
+      <w:numFmt w:val="decimal"/>
+      <w:lvlText w:val="%1."/>
+      <w:lvlJc w:val="left"/>
+      <w:pPr>
+        <w:ind w:left="720" w:hanging="360"/>
+      </w:pPr>
+      <w:rPr>
+        <w:rFonts w:hint="default"/>
+      </w:rPr>
+    </w:lvl>
+    <w:lvl w:ilvl="1" w:tplc="40090019" w:tentative="1">
+      <w:start w:val="1"/>
+      <w:numFmt w:val="lowerLetter"/>
+      <w:lvlText w:val="%2."/>
+      <w:lvlJc w:val="left"/>
+      <w:pPr>
+        <w:ind w:left="1440" w:hanging="360"/>
+      </w:pPr>
+    </w:lvl>
+    <w:lvl w:ilvl="2" w:tplc="4009001B" w:tentative="1">
+      <w:start w:val="1"/>
+      <w:numFmt w:val="lowerRoman"/>
+      <w:lvlText w:val="%3."/>
+      <w:lvlJc w:val="right"/>
+      <w:pPr>
+        <w:ind w:left="2160" w:hanging="180"/>
+      </w:pPr>
+    </w:lvl>
+    <w:lvl w:ilvl="3" w:tplc="4009000F" w:tentative="1">
+      <w:start w:val="1"/>
+      <w:numFmt w:val="decimal"/>
+      <w:lvlText w:val="%4."/>
+      <w:lvlJc w:val="left"/>
+      <w:pPr>
+        <w:ind w:left="2880" w:hanging="360"/>
+      </w:pPr>
+    </w:lvl>
+    <w:lvl w:ilvl="4" w:tplc="40090019" w:tentative="1">
+      <w:start w:val="1"/>
+      <w:numFmt w:val="lowerLetter"/>
+      <w:lvlText w:val="%5."/>
+      <w:lvlJc w:val="left"/>
+      <w:pPr>
+        <w:ind w:left="3600" w:hanging="360"/>
+      </w:pPr>
+    </w:lvl>
+    <w:lvl w:ilvl="5" w:tplc="4009001B" w:tentative="1">
+      <w:start w:val="1"/>
+      <w:numFmt w:val="lowerRoman"/>
+      <w:lvlText w:val="%6."/>
+      <w:lvlJc w:val="right"/>
+      <w:pPr>
+        <w:ind w:left="4320" w:hanging="180"/>
+      </w:pPr>
+    </w:lvl>
+    <w:lvl w:ilvl="6" w:tplc="4009000F" w:tentative="1">
+      <w:start w:val="1"/>
+      <w:numFmt w:val="decimal"/>
+      <w:lvlText w:val="%7."/>
+      <w:lvlJc w:val="left"/>
+      <w:pPr>
+        <w:ind w:left="5040" w:hanging="360"/>
+      </w:pPr>
+    </w:lvl>
+    <w:lvl w:ilvl="7" w:tplc="40090019" w:tentative="1">
+      <w:start w:val="1"/>
+      <w:numFmt w:val="lowerLetter"/>
+      <w:lvlText w:val="%8."/>
+      <w:lvlJc w:val="left"/>
+      <w:pPr>
+        <w:ind w:left="5760" w:hanging="360"/>
+      </w:pPr>
+    </w:lvl>
+    <w:lvl w:ilvl="8" w:tplc="4009001B" w:tentative="1">
+      <w:start w:val="1"/>
+      <w:numFmt w:val="lowerRoman"/>
+      <w:lvlText w:val="%9."/>
+      <w:lvlJc w:val="right"/>
+      <w:pPr>
+        <w:ind w:left="6480" w:hanging="180"/>
+      </w:pPr>
+    </w:lvl>
+  </w:abstractNum>
+  <w:abstractNum w:abstractNumId="7">
     <w:nsid w:val="20ED4CC6"/>
     <w:multiLevelType w:val="hybridMultilevel"/>
     <w:tmpl w:val="61DCB8B2"/>
@@ -5647,7 +6380,7 @@
       </w:pPr>
     </w:lvl>
   </w:abstractNum>
-  <w:abstractNum w:abstractNumId="7">
+  <w:abstractNum w:abstractNumId="8">
     <w:nsid w:val="2C6967F1"/>
     <w:multiLevelType w:val="hybridMultilevel"/>
     <w:tmpl w:val="169E1540"/>
@@ -5736,7 +6469,7 @@
       </w:pPr>
     </w:lvl>
   </w:abstractNum>
-  <w:abstractNum w:abstractNumId="8">
+  <w:abstractNum w:abstractNumId="9">
     <w:nsid w:val="3DB331C0"/>
     <w:multiLevelType w:val="hybridMultilevel"/>
     <w:tmpl w:val="799009A8"/>
@@ -5849,7 +6582,7 @@
       </w:rPr>
     </w:lvl>
   </w:abstractNum>
-  <w:abstractNum w:abstractNumId="9">
+  <w:abstractNum w:abstractNumId="10">
     <w:nsid w:val="484C517E"/>
     <w:multiLevelType w:val="hybridMultilevel"/>
     <w:tmpl w:val="C10A4ADA"/>
@@ -5938,7 +6671,96 @@
       </w:pPr>
     </w:lvl>
   </w:abstractNum>
-  <w:abstractNum w:abstractNumId="10">
+  <w:abstractNum w:abstractNumId="11">
+    <w:nsid w:val="629E0B7C"/>
+    <w:multiLevelType w:val="hybridMultilevel"/>
+    <w:tmpl w:val="0E28604A"/>
+    <w:lvl w:ilvl="0" w:tplc="4009000F">
+      <w:start w:val="1"/>
+      <w:numFmt w:val="decimal"/>
+      <w:lvlText w:val="%1."/>
+      <w:lvlJc w:val="left"/>
+      <w:pPr>
+        <w:ind w:left="720" w:hanging="360"/>
+      </w:pPr>
+      <w:rPr>
+        <w:rFonts w:hint="default"/>
+      </w:rPr>
+    </w:lvl>
+    <w:lvl w:ilvl="1" w:tplc="40090019" w:tentative="1">
+      <w:start w:val="1"/>
+      <w:numFmt w:val="lowerLetter"/>
+      <w:lvlText w:val="%2."/>
+      <w:lvlJc w:val="left"/>
+      <w:pPr>
+        <w:ind w:left="1440" w:hanging="360"/>
+      </w:pPr>
+    </w:lvl>
+    <w:lvl w:ilvl="2" w:tplc="4009001B" w:tentative="1">
+      <w:start w:val="1"/>
+      <w:numFmt w:val="lowerRoman"/>
+      <w:lvlText w:val="%3."/>
+      <w:lvlJc w:val="right"/>
+      <w:pPr>
+        <w:ind w:left="2160" w:hanging="180"/>
+      </w:pPr>
+    </w:lvl>
+    <w:lvl w:ilvl="3" w:tplc="4009000F" w:tentative="1">
+      <w:start w:val="1"/>
+      <w:numFmt w:val="decimal"/>
+      <w:lvlText w:val="%4."/>
+      <w:lvlJc w:val="left"/>
+      <w:pPr>
+        <w:ind w:left="2880" w:hanging="360"/>
+      </w:pPr>
+    </w:lvl>
+    <w:lvl w:ilvl="4" w:tplc="40090019" w:tentative="1">
+      <w:start w:val="1"/>
+      <w:numFmt w:val="lowerLetter"/>
+      <w:lvlText w:val="%5."/>
+      <w:lvlJc w:val="left"/>
+      <w:pPr>
+        <w:ind w:left="3600" w:hanging="360"/>
+      </w:pPr>
+    </w:lvl>
+    <w:lvl w:ilvl="5" w:tplc="4009001B" w:tentative="1">
+      <w:start w:val="1"/>
+      <w:numFmt w:val="lowerRoman"/>
+      <w:lvlText w:val="%6."/>
+      <w:lvlJc w:val="right"/>
+      <w:pPr>
+        <w:ind w:left="4320" w:hanging="180"/>
+      </w:pPr>
+    </w:lvl>
+    <w:lvl w:ilvl="6" w:tplc="4009000F" w:tentative="1">
+      <w:start w:val="1"/>
+      <w:numFmt w:val="decimal"/>
+      <w:lvlText w:val="%7."/>
+      <w:lvlJc w:val="left"/>
+      <w:pPr>
+        <w:ind w:left="5040" w:hanging="360"/>
+      </w:pPr>
+    </w:lvl>
+    <w:lvl w:ilvl="7" w:tplc="40090019" w:tentative="1">
+      <w:start w:val="1"/>
+      <w:numFmt w:val="lowerLetter"/>
+      <w:lvlText w:val="%8."/>
+      <w:lvlJc w:val="left"/>
+      <w:pPr>
+        <w:ind w:left="5760" w:hanging="360"/>
+      </w:pPr>
+    </w:lvl>
+    <w:lvl w:ilvl="8" w:tplc="4009001B" w:tentative="1">
+      <w:start w:val="1"/>
+      <w:numFmt w:val="lowerRoman"/>
+      <w:lvlText w:val="%9."/>
+      <w:lvlJc w:val="right"/>
+      <w:pPr>
+        <w:ind w:left="6480" w:hanging="180"/>
+      </w:pPr>
+    </w:lvl>
+  </w:abstractNum>
+  <w:abstractNum w:abstractNumId="12">
     <w:nsid w:val="6EF56B4D"/>
     <w:multiLevelType w:val="hybridMultilevel"/>
     <w:tmpl w:val="601C932C"/>
@@ -6051,7 +6873,7 @@
       </w:rPr>
     </w:lvl>
   </w:abstractNum>
-  <w:abstractNum w:abstractNumId="11">
+  <w:abstractNum w:abstractNumId="13">
     <w:nsid w:val="6FEA40AA"/>
     <w:multiLevelType w:val="hybridMultilevel"/>
     <w:tmpl w:val="D9DC8DF8"/>
@@ -6164,7 +6986,7 @@
       </w:rPr>
     </w:lvl>
   </w:abstractNum>
-  <w:abstractNum w:abstractNumId="12">
+  <w:abstractNum w:abstractNumId="14">
     <w:nsid w:val="782572B8"/>
     <w:multiLevelType w:val="hybridMultilevel"/>
     <w:tmpl w:val="77DE109A"/>
@@ -6278,7 +7100,7 @@
     </w:lvl>
   </w:abstractNum>
   <w:num w:numId="1">
-    <w:abstractNumId w:val="12"/>
+    <w:abstractNumId w:val="14"/>
   </w:num>
   <w:num w:numId="2">
     <w:abstractNumId w:val="0"/>
@@ -6287,10 +7109,10 @@
     <w:abstractNumId w:val="1"/>
   </w:num>
   <w:num w:numId="4">
-    <w:abstractNumId w:val="10"/>
+    <w:abstractNumId w:val="12"/>
   </w:num>
   <w:num w:numId="5">
-    <w:abstractNumId w:val="8"/>
+    <w:abstractNumId w:val="9"/>
   </w:num>
   <w:num w:numId="6">
     <w:abstractNumId w:val="2"/>
@@ -6302,19 +7124,25 @@
     <w:abstractNumId w:val="3"/>
   </w:num>
   <w:num w:numId="9">
-    <w:abstractNumId w:val="6"/>
+    <w:abstractNumId w:val="7"/>
   </w:num>
   <w:num w:numId="10">
-    <w:abstractNumId w:val="11"/>
+    <w:abstractNumId w:val="13"/>
   </w:num>
   <w:num w:numId="11">
-    <w:abstractNumId w:val="7"/>
+    <w:abstractNumId w:val="8"/>
   </w:num>
   <w:num w:numId="12">
-    <w:abstractNumId w:val="9"/>
+    <w:abstractNumId w:val="10"/>
   </w:num>
   <w:num w:numId="13">
     <w:abstractNumId w:val="4"/>
+  </w:num>
+  <w:num w:numId="14">
+    <w:abstractNumId w:val="6"/>
+  </w:num>
+  <w:num w:numId="15">
+    <w:abstractNumId w:val="11"/>
   </w:num>
 </w:numbering>
 </file>
@@ -6718,7 +7546,6 @@
   <w:style w:type="character" w:default="1" w:styleId="DefaultParagraphFont">
     <w:name w:val="Default Paragraph Font"/>
     <w:uiPriority w:val="1"/>
-    <w:semiHidden/>
     <w:unhideWhenUsed/>
   </w:style>
   <w:style w:type="table" w:default="1" w:styleId="TableNormal">

</xml_diff>